<commit_message>
Add pre-swap sandbox live testing & demo phase to workplan
- Insert Phase 4 'Sandbox live testing & demo' before cutover (now Phase 5)
- Add §11.1: production-parity sandbox, live end-to-end demo of all product
  types + integrations, UAT, parallel run (soft launch), go/no-go checklist
- Update Gantt roadmap and phase table; existing store kept as rollback target
- Risk R6 references the new gate; add open decision D9 (parallel-run length/sign-off)
- Regenerate Word docs

https://claude.ai/code/session_01PjUHwFTYmLhh9nLNKk68Yq
</commit_message>
<xml_diff>
--- a/word/01-Master-Plan.docx
+++ b/word/01-Master-Plan.docx
@@ -5222,7 +5222,7 @@
           <w:rFonts w:ascii="Consolas" w:hAnsi="Consolas"/>
           <w:sz w:val="18"/>
         </w:rPr>
-        <w:t xml:space="preserve">    section Phase 4 — Hardening &amp; launch</w:t>
+        <w:t xml:space="preserve">    section Phase 4 — Sandbox live testing &amp; demo</w:t>
       </w:r>
       <w:r>
         <w:br/>
@@ -5232,7 +5232,57 @@
           <w:rFonts w:ascii="Consolas" w:hAnsi="Consolas"/>
           <w:sz w:val="18"/>
         </w:rPr>
-        <w:t xml:space="preserve">    Perf/a11y/SEO + cutover              :p4a, after p3b, 21d</w:t>
+        <w:t xml:space="preserve">    Stand up production-parity sandbox   :p4a, after p3b, 10d</w:t>
+      </w:r>
+      <w:r>
+        <w:br/>
+      </w:r>
+      <w:r>
+        <w:rPr>
+          <w:rFonts w:ascii="Consolas" w:hAnsi="Consolas"/>
+          <w:sz w:val="18"/>
+        </w:rPr>
+        <w:t xml:space="preserve">    Perf / a11y / SEO hardening          :p4b, after p3b, 21d</w:t>
+      </w:r>
+      <w:r>
+        <w:br/>
+      </w:r>
+      <w:r>
+        <w:rPr>
+          <w:rFonts w:ascii="Consolas" w:hAnsi="Consolas"/>
+          <w:sz w:val="18"/>
+        </w:rPr>
+        <w:t xml:space="preserve">    Live end-to-end demo + UAT sign-off  :p4c, after p4a, 14d</w:t>
+      </w:r>
+      <w:r>
+        <w:br/>
+      </w:r>
+      <w:r>
+        <w:rPr>
+          <w:rFonts w:ascii="Consolas" w:hAnsi="Consolas"/>
+          <w:sz w:val="18"/>
+        </w:rPr>
+        <w:t xml:space="preserve">    Parallel run (sandbox ∥ live store)  :p4d, after p4c, 14d</w:t>
+      </w:r>
+      <w:r>
+        <w:br/>
+      </w:r>
+      <w:r>
+        <w:rPr>
+          <w:rFonts w:ascii="Consolas" w:hAnsi="Consolas"/>
+          <w:sz w:val="18"/>
+        </w:rPr>
+        <w:t xml:space="preserve">    section Phase 5 — Cutover &amp; launch</w:t>
+      </w:r>
+      <w:r>
+        <w:br/>
+      </w:r>
+      <w:r>
+        <w:rPr>
+          <w:rFonts w:ascii="Consolas" w:hAnsi="Consolas"/>
+          <w:sz w:val="18"/>
+        </w:rPr>
+        <w:t xml:space="preserve">    Go/no-go · DNS swap · post-launch watch :p5a, after p4d, 7d</w:t>
       </w:r>
     </w:p>
     <w:tbl>
@@ -5438,7 +5488,7 @@
               <w:rPr>
                 <w:b/>
               </w:rPr>
-              <w:t>4 — Hardening &amp; launch</w:t>
+              <w:t>4 — Sandbox live testing &amp; demo</w:t>
             </w:r>
           </w:p>
         </w:tc>
@@ -5448,7 +5498,25 @@
           </w:tcPr>
           <w:p>
             <w:r>
-              <w:t>Production cutover.</w:t>
+              <w:t xml:space="preserve">A production-parity sandbox where the whole store is exercised </w:t>
+            </w:r>
+            <w:r>
+              <w:rPr>
+                <w:b/>
+              </w:rPr>
+              <w:t>live</w:t>
+            </w:r>
+            <w:r>
+              <w:t xml:space="preserve"> and demoed for sign-off </w:t>
+            </w:r>
+            <w:r>
+              <w:rPr>
+                <w:b/>
+              </w:rPr>
+              <w:t>before any swap</w:t>
+            </w:r>
+            <w:r>
+              <w:t>. The existing store keeps serving customers untouched.</w:t>
             </w:r>
           </w:p>
         </w:tc>
@@ -5458,13 +5526,513 @@
           </w:tcPr>
           <w:p>
             <w:r>
-              <w:t>NFRs met; SEO preserved; rollback plan tested.</w:t>
+              <w:t xml:space="preserve">All product types + all 4 integrations pass live end-to-end in sandbox; stakeholder demo signed off; NFRs (perf/a11y/SEO) met; parallel run clean; </w:t>
+            </w:r>
+            <w:r>
+              <w:rPr>
+                <w:b/>
+              </w:rPr>
+              <w:t>go/no-go = GO</w:t>
+            </w:r>
+            <w:r>
+              <w:t>.</w:t>
+            </w:r>
+          </w:p>
+        </w:tc>
+      </w:tr>
+      <w:tr>
+        <w:tc>
+          <w:tcPr>
+            <w:tcW w:type="dxa" w:w="3216"/>
+          </w:tcPr>
+          <w:p>
+            <w:r>
+              <w:rPr>
+                <w:b/>
+              </w:rPr>
+              <w:t>5 — Cutover &amp; launch</w:t>
+            </w:r>
+          </w:p>
+        </w:tc>
+        <w:tc>
+          <w:tcPr>
+            <w:tcW w:type="dxa" w:w="3216"/>
+          </w:tcPr>
+          <w:p>
+            <w:r>
+              <w:t>Production swap from the existing store.</w:t>
+            </w:r>
+          </w:p>
+        </w:tc>
+        <w:tc>
+          <w:tcPr>
+            <w:tcW w:type="dxa" w:w="3216"/>
+          </w:tcPr>
+          <w:p>
+            <w:r>
+              <w:t>301 map live; DNS swapped; rollback tested &amp; on standby; post-launch monitoring green.</w:t>
             </w:r>
           </w:p>
         </w:tc>
       </w:tr>
     </w:tbl>
     <w:p/>
+    <w:p>
+      <w:pPr>
+        <w:pStyle w:val="Heading3"/>
+      </w:pPr>
+      <w:r>
+        <w:t>11.1 Sandbox live testing &amp; demo — the pre-swap gate</w:t>
+      </w:r>
+    </w:p>
+    <w:p>
+      <w:r>
+        <w:rPr>
+          <w:b/>
+        </w:rPr>
+        <w:t>Before the existing mejadesigns.com is swapped for the new store, everything runs first in a production-parity sandbox that is exercised *live* and demoed for sign-off.</w:t>
+      </w:r>
+      <w:r>
+        <w:t xml:space="preserve"> The current store keeps serving real customers, untouched, until the go/no-go gate passes — so there is zero customer risk during testing.</w:t>
+      </w:r>
+    </w:p>
+    <w:p>
+      <w:r>
+        <w:rPr>
+          <w:b/>
+        </w:rPr>
+        <w:t>Sandbox environment (mirrors production, fully isolated data):</w:t>
+      </w:r>
+    </w:p>
+    <w:tbl>
+      <w:tblPr>
+        <w:tblStyle w:val="LightGrid-Accent1"/>
+        <w:tblW w:type="auto" w:w="0"/>
+        <w:tblLayout w:type="autofit"/>
+        <w:tblLook w:firstColumn="1" w:firstRow="1" w:lastColumn="0" w:lastRow="0" w:noHBand="0" w:noVBand="1" w:val="04A0"/>
+      </w:tblPr>
+      <w:tblGrid>
+        <w:gridCol w:w="4824"/>
+        <w:gridCol w:w="4824"/>
+      </w:tblGrid>
+      <w:tr>
+        <w:tc>
+          <w:tcPr>
+            <w:tcW w:type="dxa" w:w="4824"/>
+          </w:tcPr>
+          <w:p>
+            <w:r>
+              <w:rPr>
+                <w:b/>
+              </w:rPr>
+              <w:t>Component</w:t>
+            </w:r>
+          </w:p>
+        </w:tc>
+        <w:tc>
+          <w:tcPr>
+            <w:tcW w:type="dxa" w:w="4824"/>
+          </w:tcPr>
+          <w:p>
+            <w:r>
+              <w:rPr>
+                <w:b/>
+              </w:rPr>
+              <w:t>Sandbox form</w:t>
+            </w:r>
+          </w:p>
+        </w:tc>
+      </w:tr>
+      <w:tr>
+        <w:tc>
+          <w:tcPr>
+            <w:tcW w:type="dxa" w:w="4824"/>
+          </w:tcPr>
+          <w:p>
+            <w:r>
+              <w:t>Shopify</w:t>
+            </w:r>
+          </w:p>
+        </w:tc>
+        <w:tc>
+          <w:tcPr>
+            <w:tcW w:type="dxa" w:w="4824"/>
+          </w:tcPr>
+          <w:p>
+            <w:r>
+              <w:t xml:space="preserve">Development/preview store (or password-protected staging theme) using a </w:t>
+            </w:r>
+            <w:r>
+              <w:rPr>
+                <w:b/>
+              </w:rPr>
+              <w:t>test payment gateway</w:t>
+            </w:r>
+            <w:r>
+              <w:t xml:space="preserve"> (Shopify Bogus Gateway) — no real charges.</w:t>
+            </w:r>
+          </w:p>
+        </w:tc>
+      </w:tr>
+      <w:tr>
+        <w:tc>
+          <w:tcPr>
+            <w:tcW w:type="dxa" w:w="4824"/>
+          </w:tcPr>
+          <w:p>
+            <w:r>
+              <w:t>MEJA‑CRM</w:t>
+            </w:r>
+          </w:p>
+        </w:tc>
+        <w:tc>
+          <w:tcPr>
+            <w:tcW w:type="dxa" w:w="4824"/>
+          </w:tcPr>
+          <w:p>
+            <w:r>
+              <w:t xml:space="preserve">CRM sandbox/test tenant pushing </w:t>
+            </w:r>
+            <w:r>
+              <w:rPr>
+                <w:b/>
+              </w:rPr>
+              <w:t>demo</w:t>
+            </w:r>
+            <w:r>
+              <w:t xml:space="preserve"> quotes only (no real customer PII).</w:t>
+            </w:r>
+          </w:p>
+        </w:tc>
+      </w:tr>
+      <w:tr>
+        <w:tc>
+          <w:tcPr>
+            <w:tcW w:type="dxa" w:w="4824"/>
+          </w:tcPr>
+          <w:p>
+            <w:r>
+              <w:t>Atelier3d</w:t>
+            </w:r>
+          </w:p>
+        </w:tc>
+        <w:tc>
+          <w:tcPr>
+            <w:tcW w:type="dxa" w:w="4824"/>
+          </w:tcPr>
+          <w:p>
+            <w:r>
+              <w:t>Sandbox project + keys; same option models as production.</w:t>
+            </w:r>
+          </w:p>
+        </w:tc>
+      </w:tr>
+      <w:tr>
+        <w:tc>
+          <w:tcPr>
+            <w:tcW w:type="dxa" w:w="4824"/>
+          </w:tcPr>
+          <w:p>
+            <w:r>
+              <w:t>4K render engine</w:t>
+            </w:r>
+          </w:p>
+        </w:tc>
+        <w:tc>
+          <w:tcPr>
+            <w:tcW w:type="dxa" w:w="4824"/>
+          </w:tcPr>
+          <w:p>
+            <w:r>
+              <w:t xml:space="preserve">Test render queue writing to a </w:t>
+            </w:r>
+            <w:r>
+              <w:rPr>
+                <w:b/>
+              </w:rPr>
+              <w:t>non-production</w:t>
+            </w:r>
+            <w:r>
+              <w:t xml:space="preserve"> CDN bucket.</w:t>
+            </w:r>
+          </w:p>
+        </w:tc>
+      </w:tr>
+      <w:tr>
+        <w:tc>
+          <w:tcPr>
+            <w:tcW w:type="dxa" w:w="4824"/>
+          </w:tcPr>
+          <w:p>
+            <w:r>
+              <w:t>Integration Layer</w:t>
+            </w:r>
+          </w:p>
+        </w:tc>
+        <w:tc>
+          <w:tcPr>
+            <w:tcW w:type="dxa" w:w="4824"/>
+          </w:tcPr>
+          <w:p>
+            <w:r>
+              <w:t>Staging deployment with its own DB, secrets, and webhook endpoints.</w:t>
+            </w:r>
+          </w:p>
+        </w:tc>
+      </w:tr>
+    </w:tbl>
+    <w:p/>
+    <w:p>
+      <w:r>
+        <w:rPr>
+          <w:b/>
+        </w:rPr>
+        <w:t>Live demo scope — every workflow exercised end-to-end, for real, in the sandbox:</w:t>
+      </w:r>
+    </w:p>
+    <w:p>
+      <w:pPr>
+        <w:pStyle w:val="ListBullet"/>
+      </w:pPr>
+      <w:r>
+        <w:t>Ready-made purchase → test checkout → order created.</w:t>
+      </w:r>
+    </w:p>
+    <w:p>
+      <w:pPr>
+        <w:pStyle w:val="ListBullet"/>
+      </w:pPr>
+      <w:r>
+        <w:t xml:space="preserve">CRM pushes a </w:t>
+      </w:r>
+      <w:r>
+        <w:rPr>
+          <w:b/>
+        </w:rPr>
+        <w:t>private/unlisted</w:t>
+      </w:r>
+      <w:r>
+        <w:t xml:space="preserve"> quote → signed link opens → buy.</w:t>
+      </w:r>
+    </w:p>
+    <w:p>
+      <w:pPr>
+        <w:pStyle w:val="ListBullet"/>
+      </w:pPr>
+      <w:r>
+        <w:rPr>
+          <w:b/>
+        </w:rPr>
+        <w:t>Configurable shelf</w:t>
+      </w:r>
+      <w:r>
+        <w:t xml:space="preserve"> (Tile, Art Back, </w:t>
+      </w:r>
+      <w:r>
+        <w:rPr>
+          <w:b/>
+        </w:rPr>
+        <w:t>and</w:t>
+      </w:r>
+      <w:r>
+        <w:t xml:space="preserve"> at least one additional style) → live price + 4K render → buy.</w:t>
+      </w:r>
+    </w:p>
+    <w:p>
+      <w:pPr>
+        <w:pStyle w:val="ListBullet"/>
+      </w:pPr>
+      <w:r>
+        <w:rPr>
+          <w:b/>
+        </w:rPr>
+        <w:t>Hybrid</w:t>
+      </w:r>
+      <w:r>
+        <w:t xml:space="preserve"> listing → edit unlocked options → price/render update → buy.</w:t>
+      </w:r>
+    </w:p>
+    <w:p>
+      <w:pPr>
+        <w:pStyle w:val="ListBullet"/>
+      </w:pPr>
+      <w:r>
+        <w:rPr>
+          <w:b/>
+        </w:rPr>
+        <w:t>Atelier3d custom build</w:t>
+      </w:r>
+      <w:r>
+        <w:t xml:space="preserve"> → 3D design → 4K render → buy and/or route to a CRM quote.</w:t>
+      </w:r>
+    </w:p>
+    <w:p>
+      <w:pPr>
+        <w:pStyle w:val="ListBullet"/>
+      </w:pPr>
+      <w:r>
+        <w:t>Order → fulfillment packet (config + BOM + 4K render) reaches ops.</w:t>
+      </w:r>
+    </w:p>
+    <w:p>
+      <w:pPr>
+        <w:pStyle w:val="ListBullet"/>
+      </w:pPr>
+      <w:r>
+        <w:rPr>
+          <w:b/>
+        </w:rPr>
+        <w:t>Failure drills:</w:t>
+      </w:r>
+      <w:r>
+        <w:t xml:space="preserve"> render engine down (WebGL fallback), expired private link, invalid configuration, CRM-vs-rules price reconciliation.</w:t>
+      </w:r>
+    </w:p>
+    <w:p>
+      <w:r>
+        <w:rPr>
+          <w:b/>
+        </w:rPr>
+        <w:t>Demo &amp; UAT:</w:t>
+      </w:r>
+      <w:r>
+        <w:t xml:space="preserve"> a scheduled walkthrough for stakeholders on the live sandbox URL; UAT scripts per product type; defects logged, triaged, and re-tested; accessibility (WCAG 2.2 AA) and performance audits run against the sandbox.</w:t>
+      </w:r>
+    </w:p>
+    <w:p>
+      <w:r>
+        <w:rPr>
+          <w:b/>
+        </w:rPr>
+        <w:t>Parallel run (soft launch):</w:t>
+      </w:r>
+      <w:r>
+        <w:t xml:space="preserve"> for ~1–2 weeks the new store runs </w:t>
+      </w:r>
+      <w:r>
+        <w:rPr>
+          <w:b/>
+        </w:rPr>
+        <w:t>alongside</w:t>
+      </w:r>
+      <w:r>
+        <w:t xml:space="preserve"> the existing live store — behind a password, limited audience, or feature flag — so pricing, behavior, and integrations can be compared against today's store with </w:t>
+      </w:r>
+      <w:r>
+        <w:rPr>
+          <w:b/>
+        </w:rPr>
+        <w:t>no customer impact</w:t>
+      </w:r>
+      <w:r>
+        <w:t>.</w:t>
+      </w:r>
+    </w:p>
+    <w:p>
+      <w:r>
+        <w:rPr>
+          <w:b/>
+        </w:rPr>
+        <w:t>Go / no-go checklist — all must be GREEN to authorize the swap:</w:t>
+      </w:r>
+    </w:p>
+    <w:p>
+      <w:pPr>
+        <w:pStyle w:val="ListBullet"/>
+      </w:pPr>
+      <w:r>
+        <w:t xml:space="preserve">[ ] All five product types pass </w:t>
+      </w:r>
+      <w:r>
+        <w:rPr>
+          <w:b/>
+        </w:rPr>
+        <w:t>live</w:t>
+      </w:r>
+      <w:r>
+        <w:t xml:space="preserve"> end-to-end in the sandbox.</w:t>
+      </w:r>
+    </w:p>
+    <w:p>
+      <w:pPr>
+        <w:pStyle w:val="ListBullet"/>
+      </w:pPr>
+      <w:r>
+        <w:t>[ ] All four integrations (Shopify, MEJA‑CRM, Atelier3d, 4K render) verified live.</w:t>
+      </w:r>
+    </w:p>
+    <w:p>
+      <w:pPr>
+        <w:pStyle w:val="ListBullet"/>
+      </w:pPr>
+      <w:r>
+        <w:t>[ ] Stakeholder demo signed off.</w:t>
+      </w:r>
+    </w:p>
+    <w:p>
+      <w:pPr>
+        <w:pStyle w:val="ListBullet"/>
+      </w:pPr>
+      <w:r>
+        <w:t>[ ] Performance, accessibility (AA), and SEO-parity audits pass.</w:t>
+      </w:r>
+    </w:p>
+    <w:p>
+      <w:pPr>
+        <w:pStyle w:val="ListBullet"/>
+      </w:pPr>
+      <w:r>
+        <w:t>[ ] 301 redirect map verified; private listings excluded from indexing.</w:t>
+      </w:r>
+    </w:p>
+    <w:p>
+      <w:pPr>
+        <w:pStyle w:val="ListBullet"/>
+      </w:pPr>
+      <w:r>
+        <w:t>[ ] Rollback plan tested and on standby.</w:t>
+      </w:r>
+    </w:p>
+    <w:p>
+      <w:pPr>
+        <w:pStyle w:val="ListBullet"/>
+      </w:pPr>
+      <w:r>
+        <w:t>[ ] Parallel run shows no blocking discrepancies vs. the existing store.</w:t>
+      </w:r>
+    </w:p>
+    <w:p>
+      <w:r>
+        <w:t xml:space="preserve">Only after a recorded </w:t>
+      </w:r>
+      <w:r>
+        <w:rPr>
+          <w:b/>
+        </w:rPr>
+        <w:t>GO</w:t>
+      </w:r>
+      <w:r>
+        <w:t xml:space="preserve"> decision does </w:t>
+      </w:r>
+      <w:r>
+        <w:rPr>
+          <w:b/>
+        </w:rPr>
+        <w:t>Phase 5</w:t>
+      </w:r>
+      <w:r>
+        <w:t xml:space="preserve"> perform the cutover. The existing store remains the </w:t>
+      </w:r>
+      <w:r>
+        <w:rPr>
+          <w:b/>
+        </w:rPr>
+        <w:t>rollback target</w:t>
+      </w:r>
+      <w:r>
+        <w:t xml:space="preserve"> throughout launch.</w:t>
+      </w:r>
+    </w:p>
     <w:p>
       <w:pPr>
         <w:pBdr>
@@ -6117,7 +6685,16 @@
           </w:tcPr>
           <w:p>
             <w:r>
-              <w:t>301 map, parity audit, staged rollout, monitoring.</w:t>
+              <w:t xml:space="preserve">301 map, parity audit, </w:t>
+            </w:r>
+            <w:r>
+              <w:rPr>
+                <w:b/>
+              </w:rPr>
+              <w:t>sandbox parallel run + go/no-go gate (§11.1)</w:t>
+            </w:r>
+            <w:r>
+              <w:t>, staged rollout, monitoring; existing store kept as rollback target.</w:t>
             </w:r>
           </w:p>
         </w:tc>
@@ -6928,6 +7505,57 @@
           <w:p>
             <w:r>
               <w:t>Confirm launch styles; system supports unlimited via data.</w:t>
+            </w:r>
+          </w:p>
+        </w:tc>
+      </w:tr>
+      <w:tr>
+        <w:tc>
+          <w:tcPr>
+            <w:tcW w:type="dxa" w:w="2412"/>
+          </w:tcPr>
+          <w:p>
+            <w:r>
+              <w:rPr>
+                <w:b/>
+              </w:rPr>
+              <w:t>D9</w:t>
+            </w:r>
+          </w:p>
+        </w:tc>
+        <w:tc>
+          <w:tcPr>
+            <w:tcW w:type="dxa" w:w="2412"/>
+          </w:tcPr>
+          <w:p>
+            <w:r>
+              <w:t>Pre-swap parallel-run length &amp; demo sign-off group (§11.1)</w:t>
+            </w:r>
+          </w:p>
+        </w:tc>
+        <w:tc>
+          <w:tcPr>
+            <w:tcW w:type="dxa" w:w="2412"/>
+          </w:tcPr>
+          <w:p>
+            <w:r>
+              <w:t>1 wk / 2 wks / longer · who signs off</w:t>
+            </w:r>
+          </w:p>
+        </w:tc>
+        <w:tc>
+          <w:tcPr>
+            <w:tcW w:type="dxa" w:w="2412"/>
+          </w:tcPr>
+          <w:p>
+            <w:r>
+              <w:rPr>
+                <w:b/>
+              </w:rPr>
+              <w:t>~2 weeks</w:t>
+            </w:r>
+            <w:r>
+              <w:t xml:space="preserve"> parallel run; named stakeholders sign the recorded go/no-go before swap.</w:t>
             </w:r>
           </w:p>
         </w:tc>

</xml_diff>

<commit_message>
Clarify policy: all items custom-made, no returns/exchanges
- Workflows §12.6: replace 'limited/no-return' with explicit no-returns policy
  (made to order); defects → repair/rework/remake; refund only if MEJA cannot fulfill
- Custom-build exceptions: no customer-initiated returns
- Master Plan IA: content pages reflect made-to-order/no-returns policy
- UI Standard: add 'Made to order · no returns' microcopy near add-to-cart/cart/checkout
- Regenerate Word docs

https://claude.ai/code/session_01PjUHwFTYmLhh9nLNKk68Yq
</commit_message>
<xml_diff>
--- a/word/01-Master-Plan.docx
+++ b/word/01-Master-Plan.docx
@@ -4251,7 +4251,16 @@
           </w:tcPr>
           <w:p>
             <w:r>
-              <w:t>About, FAQ, care, shipping, warranty.</w:t>
+              <w:t xml:space="preserve">About, FAQ, care, shipping, </w:t>
+            </w:r>
+            <w:r>
+              <w:rPr>
+                <w:b/>
+              </w:rPr>
+              <w:t>made-to-order policy (no returns/exchanges — all items custom-made)</w:t>
+            </w:r>
+            <w:r>
+              <w:t>.</w:t>
             </w:r>
           </w:p>
         </w:tc>

</xml_diff>

<commit_message>
Add Variant & Options Engine: Shopify-native variants don't fit configurables
- Master Plan §5.4: 139,968-combination Tile-Back example exceeds Shopify's
  3-option / 2,048-variant limits; custom tile/art are un-enumerable. Define
  Option Model + Pricing Rules Engine + custom-priced line items (Cart Transform
  Functions on Plus / Draft Orders) + component-level inventory; never model
  combinations as native variants
- Thread through taxonomy principle, risk R7, decision D10, API matrix, data model
- Workflow C: configured purchase becomes a custom-priced line (not a variant)
- UI Standard: configurator mandatory; no native variant picker for configurables
- Regenerate Word docs

https://claude.ai/code/session_01PjUHwFTYmLhh9nLNKk68Yq
</commit_message>
<xml_diff>
--- a/word/01-Master-Plan.docx
+++ b/word/01-Master-Plan.docx
@@ -1460,13 +1460,63 @@
         <w:rPr>
           <w:i/>
         </w:rPr>
-        <w:t>Style</w:t>
+        <w:t xml:space="preserve">Styles </w:t>
       </w:r>
       <w:r>
         <w:rPr>
           <w:i/>
         </w:rPr>
-        <w:t xml:space="preserve"> is data, not code. Adding a new shelf style (or an entirely new configurable family) is a catalog/configuration change, never a redeploy.</w:t>
+        <w:t>and options</w:t>
+      </w:r>
+      <w:r>
+        <w:rPr>
+          <w:i/>
+        </w:rPr>
+        <w:t xml:space="preserve"> are </w:t>
+      </w:r>
+      <w:r>
+        <w:rPr>
+          <w:i/>
+        </w:rPr>
+        <w:t>data</w:t>
+      </w:r>
+      <w:r>
+        <w:rPr>
+          <w:i/>
+        </w:rPr>
+        <w:t>, not code — and not Shopify variants.</w:t>
+      </w:r>
+      <w:r>
+        <w:rPr>
+          <w:i/>
+        </w:rPr>
+        <w:t xml:space="preserve"> Adding a new shelf style, option dimension, or value is a configuration change, never a redeploy. The combinatorial option space (often 10⁵+ combinations — e.g., one Tile-Back shelf = </w:t>
+      </w:r>
+      <w:r>
+        <w:rPr>
+          <w:b/>
+          <w:i/>
+        </w:rPr>
+        <w:t>139,968</w:t>
+      </w:r>
+      <w:r>
+        <w:rPr>
+          <w:i/>
+        </w:rPr>
+        <w:t xml:space="preserve">) lives in the </w:t>
+      </w:r>
+      <w:r>
+        <w:rPr>
+          <w:b/>
+          <w:i/>
+        </w:rPr>
+        <w:t>Variant &amp; Options Engine</w:t>
+      </w:r>
+      <w:r>
+        <w:rPr>
+          <w:i/>
+        </w:rPr>
+        <w:t xml:space="preserve"> (§5.4), never in Shopify's native variant model (3-option / 2,048-variant limits).</w:t>
       </w:r>
     </w:p>
     <w:p>
@@ -2341,6 +2391,941 @@
       </w:r>
       <w:r>
         <w:t xml:space="preserve"> (see Decision D1 and the phased roadmap).</w:t>
+      </w:r>
+    </w:p>
+    <w:p>
+      <w:pPr>
+        <w:pStyle w:val="Heading3"/>
+      </w:pPr>
+      <w:r>
+        <w:t xml:space="preserve">5.4 Variant &amp; Options Engine — </w:t>
+      </w:r>
+      <w:r>
+        <w:rPr>
+          <w:i/>
+        </w:rPr>
+        <w:t>why Shopify-native variants do not fit</w:t>
+      </w:r>
+    </w:p>
+    <w:p>
+      <w:r>
+        <w:t xml:space="preserve">MEJA's configurable products explode combinatorially. A single </w:t>
+      </w:r>
+      <w:r>
+        <w:rPr>
+          <w:b/>
+        </w:rPr>
+        <w:t>Tile-Back shelf</w:t>
+      </w:r>
+      <w:r>
+        <w:t xml:space="preserve"> already produces </w:t>
+      </w:r>
+      <w:r>
+        <w:rPr>
+          <w:b/>
+        </w:rPr>
+        <w:t>139,968</w:t>
+      </w:r>
+      <w:r>
+        <w:t xml:space="preserve"> combinations:</w:t>
+      </w:r>
+    </w:p>
+    <w:tbl>
+      <w:tblPr>
+        <w:tblStyle w:val="LightGrid-Accent1"/>
+        <w:tblW w:type="auto" w:w="0"/>
+        <w:tblLayout w:type="autofit"/>
+        <w:tblLook w:firstColumn="1" w:firstRow="1" w:lastColumn="0" w:lastRow="0" w:noHBand="0" w:noVBand="1" w:val="04A0"/>
+      </w:tblPr>
+      <w:tblGrid>
+        <w:gridCol w:w="4824"/>
+        <w:gridCol w:w="4824"/>
+      </w:tblGrid>
+      <w:tr>
+        <w:tc>
+          <w:tcPr>
+            <w:tcW w:type="dxa" w:w="4824"/>
+          </w:tcPr>
+          <w:p>
+            <w:r>
+              <w:rPr>
+                <w:b/>
+              </w:rPr>
+              <w:t>Option dimension</w:t>
+            </w:r>
+          </w:p>
+        </w:tc>
+        <w:tc>
+          <w:tcPr>
+            <w:tcW w:type="dxa" w:w="4824"/>
+          </w:tcPr>
+          <w:p>
+            <w:r>
+              <w:rPr>
+                <w:b/>
+              </w:rPr>
+              <w:t>Values</w:t>
+            </w:r>
+          </w:p>
+        </w:tc>
+      </w:tr>
+      <w:tr>
+        <w:tc>
+          <w:tcPr>
+            <w:tcW w:type="dxa" w:w="4824"/>
+          </w:tcPr>
+          <w:p>
+            <w:r>
+              <w:t>Stain</w:t>
+            </w:r>
+          </w:p>
+        </w:tc>
+        <w:tc>
+          <w:tcPr>
+            <w:tcW w:type="dxa" w:w="4824"/>
+          </w:tcPr>
+          <w:p>
+            <w:r>
+              <w:t>18</w:t>
+            </w:r>
+          </w:p>
+        </w:tc>
+      </w:tr>
+      <w:tr>
+        <w:tc>
+          <w:tcPr>
+            <w:tcW w:type="dxa" w:w="4824"/>
+          </w:tcPr>
+          <w:p>
+            <w:r>
+              <w:t>Tile pattern</w:t>
+            </w:r>
+          </w:p>
+        </w:tc>
+        <w:tc>
+          <w:tcPr>
+            <w:tcW w:type="dxa" w:w="4824"/>
+          </w:tcPr>
+          <w:p>
+            <w:r>
+              <w:t>18</w:t>
+            </w:r>
+          </w:p>
+        </w:tc>
+      </w:tr>
+      <w:tr>
+        <w:tc>
+          <w:tcPr>
+            <w:tcW w:type="dxa" w:w="4824"/>
+          </w:tcPr>
+          <w:p>
+            <w:r>
+              <w:t>Length</w:t>
+            </w:r>
+          </w:p>
+        </w:tc>
+        <w:tc>
+          <w:tcPr>
+            <w:tcW w:type="dxa" w:w="4824"/>
+          </w:tcPr>
+          <w:p>
+            <w:r>
+              <w:t>8</w:t>
+            </w:r>
+          </w:p>
+        </w:tc>
+      </w:tr>
+      <w:tr>
+        <w:tc>
+          <w:tcPr>
+            <w:tcW w:type="dxa" w:w="4824"/>
+          </w:tcPr>
+          <w:p>
+            <w:r>
+              <w:t>Tile color</w:t>
+            </w:r>
+          </w:p>
+        </w:tc>
+        <w:tc>
+          <w:tcPr>
+            <w:tcW w:type="dxa" w:w="4824"/>
+          </w:tcPr>
+          <w:p>
+            <w:r>
+              <w:t>9</w:t>
+            </w:r>
+          </w:p>
+        </w:tc>
+      </w:tr>
+      <w:tr>
+        <w:tc>
+          <w:tcPr>
+            <w:tcW w:type="dxa" w:w="4824"/>
+          </w:tcPr>
+          <w:p>
+            <w:r>
+              <w:t>Hook style</w:t>
+            </w:r>
+          </w:p>
+        </w:tc>
+        <w:tc>
+          <w:tcPr>
+            <w:tcW w:type="dxa" w:w="4824"/>
+          </w:tcPr>
+          <w:p>
+            <w:r>
+              <w:t>6</w:t>
+            </w:r>
+          </w:p>
+        </w:tc>
+      </w:tr>
+      <w:tr>
+        <w:tc>
+          <w:tcPr>
+            <w:tcW w:type="dxa" w:w="4824"/>
+          </w:tcPr>
+          <w:p>
+            <w:r>
+              <w:rPr>
+                <w:b/>
+              </w:rPr>
+              <w:t>Total combinations</w:t>
+            </w:r>
+          </w:p>
+        </w:tc>
+        <w:tc>
+          <w:tcPr>
+            <w:tcW w:type="dxa" w:w="4824"/>
+          </w:tcPr>
+          <w:p>
+            <w:r>
+              <w:rPr>
+                <w:b/>
+              </w:rPr>
+              <w:t>18 × 18 × 8 × 9 × 6 = 139,968</w:t>
+            </w:r>
+          </w:p>
+        </w:tc>
+      </w:tr>
+    </w:tbl>
+    <w:p/>
+    <w:p>
+      <w:r>
+        <w:t xml:space="preserve">Shopify cannot model this natively, on </w:t>
+      </w:r>
+      <w:r>
+        <w:rPr>
+          <w:b/>
+        </w:rPr>
+        <w:t>two</w:t>
+      </w:r>
+      <w:r>
+        <w:t xml:space="preserve"> independent limits — and a third issue makes it impossible regardless:</w:t>
+      </w:r>
+    </w:p>
+    <w:p>
+      <w:pPr>
+        <w:pStyle w:val="ListNumber"/>
+      </w:pPr>
+      <w:r>
+        <w:rPr>
+          <w:b/>
+        </w:rPr>
+        <w:t>Option ceiling:</w:t>
+      </w:r>
+      <w:r>
+        <w:t xml:space="preserve"> Shopify allows </w:t>
+      </w:r>
+      <w:r>
+        <w:rPr>
+          <w:b/>
+        </w:rPr>
+        <w:t>3 options per product</w:t>
+      </w:r>
+      <w:r>
+        <w:t xml:space="preserve">; this product needs </w:t>
+      </w:r>
+      <w:r>
+        <w:rPr>
+          <w:b/>
+        </w:rPr>
+        <w:t>5</w:t>
+      </w:r>
+      <w:r>
+        <w:t xml:space="preserve"> (Art-Back, custom tile, and custom art add even more). </w:t>
+      </w:r>
+      <w:r>
+        <w:rPr>
+          <w:i/>
+        </w:rPr>
+        <w:t>(Shopify, current as of 2025-10-15.)</w:t>
+      </w:r>
+    </w:p>
+    <w:p>
+      <w:pPr>
+        <w:pStyle w:val="ListNumber"/>
+      </w:pPr>
+      <w:r>
+        <w:rPr>
+          <w:b/>
+        </w:rPr>
+        <w:t>Variant ceiling:</w:t>
+      </w:r>
+      <w:r>
+        <w:t xml:space="preserve"> Shopify allows </w:t>
+      </w:r>
+      <w:r>
+        <w:rPr>
+          <w:b/>
+        </w:rPr>
+        <w:t>2,048 variants per product</w:t>
+      </w:r>
+      <w:r>
+        <w:t xml:space="preserve"> (raised from 100 on 2025-10-15); 139,968 is </w:t>
+      </w:r>
+      <w:r>
+        <w:rPr>
+          <w:b/>
+        </w:rPr>
+        <w:t>~68× over</w:t>
+      </w:r>
+      <w:r>
+        <w:t>.</w:t>
+      </w:r>
+    </w:p>
+    <w:p>
+      <w:pPr>
+        <w:pStyle w:val="ListNumber"/>
+      </w:pPr>
+      <w:r>
+        <w:rPr>
+          <w:b/>
+        </w:rPr>
+        <w:t>Un-enumerable inputs:</w:t>
+      </w:r>
+      <w:r>
+        <w:t xml:space="preserve"> </w:t>
+      </w:r>
+      <w:r>
+        <w:rPr>
+          <w:b/>
+        </w:rPr>
+        <w:t>custom tile</w:t>
+      </w:r>
+      <w:r>
+        <w:t xml:space="preserve"> and </w:t>
+      </w:r>
+      <w:r>
+        <w:rPr>
+          <w:b/>
+        </w:rPr>
+        <w:t>custom art</w:t>
+      </w:r>
+      <w:r>
+        <w:t xml:space="preserve"> are free-form (uploaded artwork, bespoke layouts) — an </w:t>
+      </w:r>
+      <w:r>
+        <w:rPr>
+          <w:i/>
+        </w:rPr>
+        <w:t>infinite</w:t>
+      </w:r>
+      <w:r>
+        <w:t xml:space="preserve"> space that can never be pre-listed as variants.</w:t>
+      </w:r>
+    </w:p>
+    <w:p>
+      <w:r>
+        <w:rPr>
+          <w:b/>
+        </w:rPr>
+        <w:t>Conclusion: we never model option combinations as Shopify variants.</w:t>
+      </w:r>
+      <w:r>
+        <w:t xml:space="preserve"> A dedicated </w:t>
+      </w:r>
+      <w:r>
+        <w:rPr>
+          <w:b/>
+        </w:rPr>
+        <w:t>Variant &amp; Options Engine</w:t>
+      </w:r>
+      <w:r>
+        <w:t xml:space="preserve"> owns the option space; Shopify carries only the </w:t>
+      </w:r>
+      <w:r>
+        <w:rPr>
+          <w:i/>
+        </w:rPr>
+        <w:t>result</w:t>
+      </w:r>
+      <w:r>
+        <w:t xml:space="preserve"> of a configuration as a custom-priced line item.</w:t>
+      </w:r>
+    </w:p>
+    <w:p>
+      <w:r>
+        <w:rPr>
+          <w:i/>
+          <w:color w:val="666666"/>
+          <w:sz w:val="18"/>
+        </w:rPr>
+        <w:t>Diagram (Mermaid source — renders as a diagram on GitHub):</w:t>
+      </w:r>
+    </w:p>
+    <w:p>
+      <w:pPr>
+        <w:shd w:val="clear" w:color="auto" w:fill="F4F4F2"/>
+        <w:ind w:left="216" w:right="216"/>
+      </w:pPr>
+      <w:r>
+        <w:rPr>
+          <w:rFonts w:ascii="Consolas" w:hAnsi="Consolas"/>
+          <w:sz w:val="18"/>
+        </w:rPr>
+        <w:t>flowchart LR</w:t>
+      </w:r>
+      <w:r>
+        <w:br/>
+      </w:r>
+      <w:r>
+        <w:rPr>
+          <w:rFonts w:ascii="Consolas" w:hAnsi="Consolas"/>
+          <w:sz w:val="18"/>
+        </w:rPr>
+        <w:t xml:space="preserve">    subgraph Engine["Variant &amp; Options Engine (Integration Layer)"]</w:t>
+      </w:r>
+      <w:r>
+        <w:br/>
+      </w:r>
+      <w:r>
+        <w:rPr>
+          <w:rFonts w:ascii="Consolas" w:hAnsi="Consolas"/>
+          <w:sz w:val="18"/>
+        </w:rPr>
+        <w:t xml:space="preserve">      OM[Option Model&lt;br/&gt;dimensions · values · constraints · custom inputs]</w:t>
+      </w:r>
+      <w:r>
+        <w:br/>
+      </w:r>
+      <w:r>
+        <w:rPr>
+          <w:rFonts w:ascii="Consolas" w:hAnsi="Consolas"/>
+          <w:sz w:val="18"/>
+        </w:rPr>
+        <w:t xml:space="preserve">      PR[Pricing Rules Engine&lt;br/&gt;base + modifiers + formulas]</w:t>
+      </w:r>
+      <w:r>
+        <w:br/>
+      </w:r>
+      <w:r>
+        <w:rPr>
+          <w:rFonts w:ascii="Consolas" w:hAnsi="Consolas"/>
+          <w:sz w:val="18"/>
+        </w:rPr>
+        <w:t xml:space="preserve">      CFG[Configuration&lt;br/&gt;configId · selections · BOM · price · render]</w:t>
+      </w:r>
+      <w:r>
+        <w:br/>
+      </w:r>
+      <w:r>
+        <w:rPr>
+          <w:rFonts w:ascii="Consolas" w:hAnsi="Consolas"/>
+          <w:sz w:val="18"/>
+        </w:rPr>
+        <w:t xml:space="preserve">    end</w:t>
+      </w:r>
+      <w:r>
+        <w:br/>
+      </w:r>
+      <w:r>
+        <w:rPr>
+          <w:rFonts w:ascii="Consolas" w:hAnsi="Consolas"/>
+          <w:sz w:val="18"/>
+        </w:rPr>
+        <w:t xml:space="preserve">    OM --&gt; CFG</w:t>
+      </w:r>
+      <w:r>
+        <w:br/>
+      </w:r>
+      <w:r>
+        <w:rPr>
+          <w:rFonts w:ascii="Consolas" w:hAnsi="Consolas"/>
+          <w:sz w:val="18"/>
+        </w:rPr>
+        <w:t xml:space="preserve">    PR --&gt; CFG</w:t>
+      </w:r>
+      <w:r>
+        <w:br/>
+      </w:r>
+      <w:r>
+        <w:rPr>
+          <w:rFonts w:ascii="Consolas" w:hAnsi="Consolas"/>
+          <w:sz w:val="18"/>
+        </w:rPr>
+        <w:t xml:space="preserve">    CFG --&gt;|custom-priced line + configId + option props| SH[Shopify base product&lt;br/&gt;+ native checkout]</w:t>
+      </w:r>
+      <w:r>
+        <w:br/>
+      </w:r>
+      <w:r>
+        <w:rPr>
+          <w:rFonts w:ascii="Consolas" w:hAnsi="Consolas"/>
+          <w:sz w:val="18"/>
+        </w:rPr>
+        <w:t xml:space="preserve">    CFG --&gt;|component draw| INV[Component / BOM inventory]</w:t>
+      </w:r>
+    </w:p>
+    <w:p>
+      <w:r>
+        <w:rPr>
+          <w:b/>
+        </w:rPr>
+        <w:t>How it works</w:t>
+      </w:r>
+    </w:p>
+    <w:tbl>
+      <w:tblPr>
+        <w:tblStyle w:val="LightGrid-Accent1"/>
+        <w:tblW w:type="auto" w:w="0"/>
+        <w:tblLayout w:type="autofit"/>
+        <w:tblLook w:firstColumn="1" w:firstRow="1" w:lastColumn="0" w:lastRow="0" w:noHBand="0" w:noVBand="1" w:val="04A0"/>
+      </w:tblPr>
+      <w:tblGrid>
+        <w:gridCol w:w="4824"/>
+        <w:gridCol w:w="4824"/>
+      </w:tblGrid>
+      <w:tr>
+        <w:tc>
+          <w:tcPr>
+            <w:tcW w:type="dxa" w:w="4824"/>
+          </w:tcPr>
+          <w:p>
+            <w:r>
+              <w:rPr>
+                <w:b/>
+              </w:rPr>
+              <w:t>Concern</w:t>
+            </w:r>
+          </w:p>
+        </w:tc>
+        <w:tc>
+          <w:tcPr>
+            <w:tcW w:type="dxa" w:w="4824"/>
+          </w:tcPr>
+          <w:p>
+            <w:r>
+              <w:rPr>
+                <w:b/>
+              </w:rPr>
+              <w:t>Approach</w:t>
+            </w:r>
+          </w:p>
+        </w:tc>
+      </w:tr>
+      <w:tr>
+        <w:tc>
+          <w:tcPr>
+            <w:tcW w:type="dxa" w:w="4824"/>
+          </w:tcPr>
+          <w:p>
+            <w:r>
+              <w:rPr>
+                <w:b/>
+              </w:rPr>
+              <w:t>What's selectable</w:t>
+            </w:r>
+          </w:p>
+        </w:tc>
+        <w:tc>
+          <w:tcPr>
+            <w:tcW w:type="dxa" w:w="4824"/>
+          </w:tcPr>
+          <w:p>
+            <w:r>
+              <w:t xml:space="preserve">The </w:t>
+            </w:r>
+            <w:r>
+              <w:rPr>
+                <w:b/>
+              </w:rPr>
+              <w:t>Option Model</w:t>
+            </w:r>
+            <w:r>
+              <w:t xml:space="preserve"> (per family/style) defines </w:t>
+            </w:r>
+            <w:r>
+              <w:rPr>
+                <w:i/>
+              </w:rPr>
+              <w:t>unlimited</w:t>
+            </w:r>
+            <w:r>
+              <w:t xml:space="preserve"> dimensions, values, dependencies, constraints, and free-form input types (upload/text). Source of truth in the Integration Layer; mirrored to Atelier3d for the 3D scene. Adding a stain — or a whole new dimension — is </w:t>
+            </w:r>
+            <w:r>
+              <w:rPr>
+                <w:b/>
+              </w:rPr>
+              <w:t>data</w:t>
+            </w:r>
+            <w:r>
+              <w:t>, not code or variants.</w:t>
+            </w:r>
+          </w:p>
+        </w:tc>
+      </w:tr>
+      <w:tr>
+        <w:tc>
+          <w:tcPr>
+            <w:tcW w:type="dxa" w:w="4824"/>
+          </w:tcPr>
+          <w:p>
+            <w:r>
+              <w:rPr>
+                <w:b/>
+              </w:rPr>
+              <w:t>Price</w:t>
+            </w:r>
+          </w:p>
+        </w:tc>
+        <w:tc>
+          <w:tcPr>
+            <w:tcW w:type="dxa" w:w="4824"/>
+          </w:tcPr>
+          <w:p>
+            <w:r>
+              <w:t xml:space="preserve">The </w:t>
+            </w:r>
+            <w:r>
+              <w:rPr>
+                <w:b/>
+              </w:rPr>
+              <w:t>Pricing Rules Engine</w:t>
+            </w:r>
+            <w:r>
+              <w:t xml:space="preserve"> computes price deterministically: </w:t>
+            </w:r>
+            <w:r>
+              <w:rPr>
+                <w:rFonts w:ascii="Consolas" w:hAnsi="Consolas"/>
+                <w:sz w:val="19"/>
+              </w:rPr>
+              <w:t>base + Σ option modifiers + formulas</w:t>
+            </w:r>
+            <w:r>
+              <w:t xml:space="preserve"> (e.g., length → material cost, tile count → labor). Versioned. </w:t>
+            </w:r>
+            <w:r>
+              <w:rPr>
+                <w:b/>
+              </w:rPr>
+              <w:t>Server-side authority</w:t>
+            </w:r>
+            <w:r>
+              <w:t xml:space="preserve"> — the client never sets price.</w:t>
+            </w:r>
+          </w:p>
+        </w:tc>
+      </w:tr>
+      <w:tr>
+        <w:tc>
+          <w:tcPr>
+            <w:tcW w:type="dxa" w:w="4824"/>
+          </w:tcPr>
+          <w:p>
+            <w:r>
+              <w:rPr>
+                <w:b/>
+              </w:rPr>
+              <w:t>Catalog footprint in Shopify</w:t>
+            </w:r>
+          </w:p>
+        </w:tc>
+        <w:tc>
+          <w:tcPr>
+            <w:tcW w:type="dxa" w:w="4824"/>
+          </w:tcPr>
+          <w:p>
+            <w:r>
+              <w:rPr>
+                <w:b/>
+              </w:rPr>
+              <w:t>One base "configurable" product per family/style</w:t>
+            </w:r>
+            <w:r>
+              <w:t xml:space="preserve"> (a handful of products) — </w:t>
+            </w:r>
+            <w:r>
+              <w:rPr>
+                <w:i/>
+              </w:rPr>
+              <w:t>not</w:t>
+            </w:r>
+            <w:r>
+              <w:t xml:space="preserve"> 139,968 variants. The chosen configuration rides on the cart line as </w:t>
+            </w:r>
+            <w:r>
+              <w:rPr>
+                <w:b/>
+              </w:rPr>
+              <w:t>line-item properties + a `configId`</w:t>
+            </w:r>
+            <w:r>
+              <w:t>.</w:t>
+            </w:r>
+          </w:p>
+        </w:tc>
+      </w:tr>
+      <w:tr>
+        <w:tc>
+          <w:tcPr>
+            <w:tcW w:type="dxa" w:w="4824"/>
+          </w:tcPr>
+          <w:p>
+            <w:r>
+              <w:rPr>
+                <w:b/>
+              </w:rPr>
+              <w:t>Getting the price into checkout</w:t>
+            </w:r>
+            <w:r>
+              <w:t xml:space="preserve"> (Decision </w:t>
+            </w:r>
+            <w:r>
+              <w:rPr>
+                <w:b/>
+              </w:rPr>
+              <w:t>D10</w:t>
+            </w:r>
+            <w:r>
+              <w:t>)</w:t>
+            </w:r>
+          </w:p>
+        </w:tc>
+        <w:tc>
+          <w:tcPr>
+            <w:tcW w:type="dxa" w:w="4824"/>
+          </w:tcPr>
+          <w:p>
+            <w:r>
+              <w:rPr>
+                <w:b/>
+              </w:rPr>
+              <w:t>A. Cart Transform Function (Shopify Plus):</w:t>
+            </w:r>
+            <w:r>
+              <w:t xml:space="preserve"> a base variant sits in the native cart; a server-side Shopify Function rewrites its price to the engine-computed amount from the attached </w:t>
+            </w:r>
+            <w:r>
+              <w:rPr>
+                <w:rFonts w:ascii="Consolas" w:hAnsi="Consolas"/>
+                <w:sz w:val="19"/>
+              </w:rPr>
+              <w:t>configId</w:t>
+            </w:r>
+            <w:r>
+              <w:t xml:space="preserve">. Keeps native cart/checkout UX. · </w:t>
+            </w:r>
+            <w:r>
+              <w:rPr>
+                <w:b/>
+              </w:rPr>
+              <w:t>B. Draft Orders API:</w:t>
+            </w:r>
+            <w:r>
+              <w:t xml:space="preserve"> the Integration Layer creates a draft order with a custom-priced line, then converts it to a checkout. Works without Plus; ideal for </w:t>
+            </w:r>
+            <w:r>
+              <w:rPr>
+                <w:b/>
+              </w:rPr>
+              <w:t>CRM-pushed private/hybrid quotes</w:t>
+            </w:r>
+            <w:r>
+              <w:t>.</w:t>
+            </w:r>
+          </w:p>
+        </w:tc>
+      </w:tr>
+      <w:tr>
+        <w:tc>
+          <w:tcPr>
+            <w:tcW w:type="dxa" w:w="4824"/>
+          </w:tcPr>
+          <w:p>
+            <w:r>
+              <w:rPr>
+                <w:b/>
+              </w:rPr>
+              <w:t>Inventory</w:t>
+            </w:r>
+          </w:p>
+        </w:tc>
+        <w:tc>
+          <w:tcPr>
+            <w:tcW w:type="dxa" w:w="4824"/>
+          </w:tcPr>
+          <w:p>
+            <w:r>
+              <w:t xml:space="preserve">Tracked at the </w:t>
+            </w:r>
+            <w:r>
+              <w:rPr>
+                <w:b/>
+              </w:rPr>
+              <w:t>component / BOM level</w:t>
+            </w:r>
+            <w:r>
+              <w:t xml:space="preserve"> (blanks, tiles, hooks, stain), never per combination. Feasibility = component availability, not 139,968 phantom SKUs.</w:t>
+            </w:r>
+          </w:p>
+        </w:tc>
+      </w:tr>
+      <w:tr>
+        <w:tc>
+          <w:tcPr>
+            <w:tcW w:type="dxa" w:w="4824"/>
+          </w:tcPr>
+          <w:p>
+            <w:r>
+              <w:rPr>
+                <w:b/>
+              </w:rPr>
+              <w:t>Merchandising &amp; filtering</w:t>
+            </w:r>
+          </w:p>
+        </w:tc>
+        <w:tc>
+          <w:tcPr>
+            <w:tcW w:type="dxa" w:w="4824"/>
+          </w:tcPr>
+          <w:p>
+            <w:r>
+              <w:t xml:space="preserve">Collection filters (e.g., "available in walnut") are driven by </w:t>
+            </w:r>
+            <w:r>
+              <w:rPr>
+                <w:b/>
+              </w:rPr>
+              <w:t>option metadata</w:t>
+            </w:r>
+            <w:r>
+              <w:t>, not variants.</w:t>
+            </w:r>
+          </w:p>
+        </w:tc>
+      </w:tr>
+      <w:tr>
+        <w:tc>
+          <w:tcPr>
+            <w:tcW w:type="dxa" w:w="4824"/>
+          </w:tcPr>
+          <w:p>
+            <w:r>
+              <w:rPr>
+                <w:b/>
+              </w:rPr>
+              <w:t>Anti-tampering</w:t>
+            </w:r>
+          </w:p>
+        </w:tc>
+        <w:tc>
+          <w:tcPr>
+            <w:tcW w:type="dxa" w:w="4824"/>
+          </w:tcPr>
+          <w:p>
+            <w:r>
+              <w:t xml:space="preserve">Final price is always (re)computed and set </w:t>
+            </w:r>
+            <w:r>
+              <w:rPr>
+                <w:b/>
+              </w:rPr>
+              <w:t>server-side</w:t>
+            </w:r>
+            <w:r>
+              <w:t xml:space="preserve"> (Function or Draft Order) and re-validated against </w:t>
+            </w:r>
+            <w:r>
+              <w:rPr>
+                <w:rFonts w:ascii="Consolas" w:hAnsi="Consolas"/>
+                <w:sz w:val="19"/>
+              </w:rPr>
+              <w:t>configId</w:t>
+            </w:r>
+            <w:r>
+              <w:t xml:space="preserve"> at the </w:t>
+            </w:r>
+            <w:r>
+              <w:rPr>
+                <w:rFonts w:ascii="Consolas" w:hAnsi="Consolas"/>
+                <w:sz w:val="19"/>
+              </w:rPr>
+              <w:t>orders/create</w:t>
+            </w:r>
+            <w:r>
+              <w:t xml:space="preserve"> webhook.</w:t>
+            </w:r>
+          </w:p>
+        </w:tc>
+      </w:tr>
+    </w:tbl>
+    <w:p/>
+    <w:p>
+      <w:r>
+        <w:rPr>
+          <w:b/>
+        </w:rPr>
+        <w:t>Recommendation:</w:t>
+      </w:r>
+      <w:r>
+        <w:t xml:space="preserve"> </w:t>
+      </w:r>
+      <w:r>
+        <w:rPr>
+          <w:b/>
+        </w:rPr>
+        <w:t>Cart Transform Functions on Shopify Plus</w:t>
+      </w:r>
+      <w:r>
+        <w:t xml:space="preserve"> for self-serve configurators (native UX), </w:t>
+      </w:r>
+      <w:r>
+        <w:rPr>
+          <w:b/>
+        </w:rPr>
+        <w:t>plus Draft Orders</w:t>
+      </w:r>
+      <w:r>
+        <w:t xml:space="preserve"> for CRM-pushed quotes and as a non-Plus fallback. This makes </w:t>
+      </w:r>
+      <w:r>
+        <w:rPr>
+          <w:b/>
+        </w:rPr>
+        <w:t>Shopify Plus (Decision D3) effectively required</w:t>
+      </w:r>
+      <w:r>
+        <w:t xml:space="preserve">, and reinforces </w:t>
+      </w:r>
+      <w:r>
+        <w:rPr>
+          <w:b/>
+        </w:rPr>
+        <w:t>hybrid-headless (D1)</w:t>
+      </w:r>
+      <w:r>
+        <w:t xml:space="preserve"> — native variant pickers cannot express this, so the </w:t>
+      </w:r>
+      <w:r>
+        <w:rPr>
+          <w:b/>
+        </w:rPr>
+        <w:t>configurator UI is mandatory</w:t>
+      </w:r>
+      <w:r>
+        <w:t xml:space="preserve"> for these products.</w:t>
       </w:r>
     </w:p>
     <w:p>
@@ -2526,7 +3511,68 @@
           </w:tcPr>
           <w:p>
             <w:r>
-              <w:t>create/update products &amp; variants, set metafields, manage publications/visibility</w:t>
+              <w:t>create/update base products, set metafields, manage publications/visibility</w:t>
+            </w:r>
+          </w:p>
+        </w:tc>
+      </w:tr>
+      <w:tr>
+        <w:tc>
+          <w:tcPr>
+            <w:tcW w:type="dxa" w:w="2412"/>
+          </w:tcPr>
+          <w:p>
+            <w:r>
+              <w:t>Integration Layer → Shopify</w:t>
+            </w:r>
+          </w:p>
+        </w:tc>
+        <w:tc>
+          <w:tcPr>
+            <w:tcW w:type="dxa" w:w="2412"/>
+          </w:tcPr>
+          <w:p>
+            <w:r>
+              <w:t>sync</w:t>
+            </w:r>
+          </w:p>
+        </w:tc>
+        <w:tc>
+          <w:tcPr>
+            <w:tcW w:type="dxa" w:w="2412"/>
+          </w:tcPr>
+          <w:p>
+            <w:r>
+              <w:t>Draft Orders / Cart Transform Function</w:t>
+            </w:r>
+          </w:p>
+        </w:tc>
+        <w:tc>
+          <w:tcPr>
+            <w:tcW w:type="dxa" w:w="2412"/>
+          </w:tcPr>
+          <w:p>
+            <w:r>
+              <w:t xml:space="preserve">set the </w:t>
+            </w:r>
+            <w:r>
+              <w:rPr>
+                <w:b/>
+              </w:rPr>
+              <w:t>configured line price</w:t>
+            </w:r>
+            <w:r>
+              <w:t xml:space="preserve"> (server-side) + attach </w:t>
+            </w:r>
+            <w:r>
+              <w:rPr>
+                <w:rFonts w:ascii="Consolas" w:hAnsi="Consolas"/>
+                <w:sz w:val="19"/>
+              </w:rPr>
+              <w:t>configId</w:t>
+            </w:r>
+            <w:r>
+              <w:t xml:space="preserve"> &amp; option properties — see §5.4</w:t>
             </w:r>
           </w:p>
         </w:tc>
@@ -3824,7 +4870,25 @@
         <w:t>Shopify holds</w:t>
       </w:r>
       <w:r>
-        <w:t xml:space="preserve"> products, variants, inventory, orders, customers (system of record).</w:t>
+        <w:t xml:space="preserve"> base products (a handful per family/style — </w:t>
+      </w:r>
+      <w:r>
+        <w:rPr>
+          <w:b/>
+        </w:rPr>
+        <w:t>not</w:t>
+      </w:r>
+      <w:r>
+        <w:t xml:space="preserve"> the option combinations), </w:t>
+      </w:r>
+      <w:r>
+        <w:rPr>
+          <w:b/>
+        </w:rPr>
+        <w:t>component-level inventory</w:t>
+      </w:r>
+      <w:r>
+        <w:t>, orders, customers (system of record). See §5.4 for why combinations are never stored as variants.</w:t>
       </w:r>
     </w:p>
     <w:p>
@@ -3847,7 +4911,25 @@
         <w:t>mapping &amp; state</w:t>
       </w:r>
       <w:r>
-        <w:t xml:space="preserve"> Shopify can't model well: option models, configurations, render-job state, quote↔product links, pricing rulesets, signed-access tokens.</w:t>
+        <w:t xml:space="preserve"> Shopify can't model well: </w:t>
+      </w:r>
+      <w:r>
+        <w:rPr>
+          <w:b/>
+        </w:rPr>
+        <w:t>option models</w:t>
+      </w:r>
+      <w:r>
+        <w:t xml:space="preserve">, configurations, </w:t>
+      </w:r>
+      <w:r>
+        <w:rPr>
+          <w:b/>
+        </w:rPr>
+        <w:t>pricing rulesets</w:t>
+      </w:r>
+      <w:r>
+        <w:t>, render-job state, quote↔product links, signed-access tokens.</w:t>
       </w:r>
     </w:p>
     <w:p>
@@ -3858,10 +4940,34 @@
         <w:rPr>
           <w:b/>
         </w:rPr>
+        <w:t>Inventory is tracked at the component/BOM level</w:t>
+      </w:r>
+      <w:r>
+        <w:t xml:space="preserve"> (blanks, tiles, hooks, stain), not per option-combination — there is no per-combination SKU.</w:t>
+      </w:r>
+    </w:p>
+    <w:p>
+      <w:pPr>
+        <w:pStyle w:val="ListBullet"/>
+      </w:pPr>
+      <w:r>
+        <w:rPr>
+          <w:b/>
+        </w:rPr>
         <w:t>Metafields</w:t>
       </w:r>
       <w:r>
-        <w:t xml:space="preserve"> carry per-product config schema, visibility flags, and per-line-item config snapshots into Shopify so back-office/fulfillment can see them.</w:t>
+        <w:t xml:space="preserve"> carry per-product config schema, visibility flags, and per-line-item config snapshots (incl. </w:t>
+      </w:r>
+      <w:r>
+        <w:rPr>
+          <w:rFonts w:ascii="Consolas" w:hAnsi="Consolas"/>
+          <w:sz w:val="19"/>
+        </w:rPr>
+        <w:t>configId</w:t>
+      </w:r>
+      <w:r>
+        <w:t>) into Shopify so back-office/fulfillment can see exactly what was bought.</w:t>
       </w:r>
     </w:p>
     <w:p>
@@ -6725,7 +7831,7 @@
           </w:tcPr>
           <w:p>
             <w:r>
-              <w:t>Catalog can't model "styles as data"</w:t>
+              <w:t>Variant explosion exceeds Shopify limits (3 options / 2,048 variants); custom tile/art are un-enumerable</w:t>
             </w:r>
           </w:p>
         </w:tc>
@@ -6735,7 +7841,10 @@
           </w:tcPr>
           <w:p>
             <w:r>
-              <w:t>Low</w:t>
+              <w:rPr>
+                <w:b/>
+              </w:rPr>
+              <w:t>High</w:t>
             </w:r>
           </w:p>
         </w:tc>
@@ -6745,7 +7854,7 @@
           </w:tcPr>
           <w:p>
             <w:r>
-              <w:t>Med</w:t>
+              <w:t>High</w:t>
             </w:r>
           </w:p>
         </w:tc>
@@ -6755,7 +7864,13 @@
           </w:tcPr>
           <w:p>
             <w:r>
-              <w:t>Metafield-driven option models; no code change to add a style.</w:t>
+              <w:rPr>
+                <w:b/>
+              </w:rPr>
+              <w:t>Variant &amp; Options Engine (§5.4)</w:t>
+            </w:r>
+            <w:r>
+              <w:t>: options as data + server-side pricing + custom-priced line items (Cart Transform / Draft Orders); inventory at BOM level; never model combinations as native variants.</w:t>
             </w:r>
           </w:p>
         </w:tc>
@@ -7565,6 +8680,66 @@
             </w:r>
             <w:r>
               <w:t xml:space="preserve"> parallel run; named stakeholders sign the recorded go/no-go before swap.</w:t>
+            </w:r>
+          </w:p>
+        </w:tc>
+      </w:tr>
+      <w:tr>
+        <w:tc>
+          <w:tcPr>
+            <w:tcW w:type="dxa" w:w="2412"/>
+          </w:tcPr>
+          <w:p>
+            <w:r>
+              <w:rPr>
+                <w:b/>
+              </w:rPr>
+              <w:t>D10</w:t>
+            </w:r>
+          </w:p>
+        </w:tc>
+        <w:tc>
+          <w:tcPr>
+            <w:tcW w:type="dxa" w:w="2412"/>
+          </w:tcPr>
+          <w:p>
+            <w:r>
+              <w:t>How configured purchases reach Shopify checkout (§5.4)</w:t>
+            </w:r>
+          </w:p>
+        </w:tc>
+        <w:tc>
+          <w:tcPr>
+            <w:tcW w:type="dxa" w:w="2412"/>
+          </w:tcPr>
+          <w:p>
+            <w:r>
+              <w:t>Cart Transform Functions (Plus) / Draft Orders API / both</w:t>
+            </w:r>
+          </w:p>
+        </w:tc>
+        <w:tc>
+          <w:tcPr>
+            <w:tcW w:type="dxa" w:w="2412"/>
+          </w:tcPr>
+          <w:p>
+            <w:r>
+              <w:rPr>
+                <w:b/>
+              </w:rPr>
+              <w:t>Both</w:t>
+            </w:r>
+            <w:r>
+              <w:t xml:space="preserve"> — Cart Transform on Plus for self-serve native UX; Draft Orders for CRM-pushed quotes &amp; non-Plus fallback. Makes </w:t>
+            </w:r>
+            <w:r>
+              <w:rPr>
+                <w:b/>
+              </w:rPr>
+              <w:t>D3 = Plus</w:t>
+            </w:r>
+            <w:r>
+              <w:t xml:space="preserve"> effectively required.</w:t>
             </w:r>
           </w:p>
         </w:tc>

</xml_diff>

<commit_message>
Add mandatory mockup-first gate: every UI needs an approved HTML mockup
- UI Standard §0.1 (rule) + §9 (mockup-first approval gate): every page layout,
  component, state, and the chosen iteration ships a self-contained HTML mockup,
  rendered to PDF/PNG and explicitly approved before any OS 2.0 theme code.
  Includes the per-UI mockup register (pages + components) and the process.
- §8 updated: produce approved mockups for *every* UI, not just hero pages.
- Master Plan: roadmap adds 'Per-UI HTML mockups → approval' task; theme build now
  depends on it; Phase 0 'done' requires approved mockups for all design-standard UI;
  added a mockup-first gate callout.
- README: document the mockup-first rule + register.
- Regenerate Word docs.

https://claude.ai/code/session_01PjUHwFTYmLhh9nLNKk68Yq
</commit_message>
<xml_diff>
--- a/word/01-Master-Plan.docx
+++ b/word/01-Master-Plan.docx
@@ -6650,7 +6650,7 @@
           <w:rFonts w:ascii="Consolas" w:hAnsi="Consolas"/>
           <w:sz w:val="18"/>
         </w:rPr>
-        <w:t xml:space="preserve">    API contracts v1 frozen              :p0c, after p0a, 14d</w:t>
+        <w:t xml:space="preserve">    Per-UI HTML mockups → approval        :p0d, after p0b, 21d</w:t>
       </w:r>
       <w:r>
         <w:br/>
@@ -6660,7 +6660,7 @@
           <w:rFonts w:ascii="Consolas" w:hAnsi="Consolas"/>
           <w:sz w:val="18"/>
         </w:rPr>
-        <w:t xml:space="preserve">    section Phase 1 — Commerce + CRM push</w:t>
+        <w:t xml:space="preserve">    API contracts v1 frozen              :p0c, after p0a, 14d</w:t>
       </w:r>
       <w:r>
         <w:br/>
@@ -6670,7 +6670,17 @@
           <w:rFonts w:ascii="Consolas" w:hAnsi="Consolas"/>
           <w:sz w:val="18"/>
         </w:rPr>
-        <w:t xml:space="preserve">    OS 2.0 theme + design tokens         :p1a, after p0b, 28d</w:t>
+        <w:t xml:space="preserve">    section Phase 1 — Commerce + CRM push</w:t>
+      </w:r>
+      <w:r>
+        <w:br/>
+      </w:r>
+      <w:r>
+        <w:rPr>
+          <w:rFonts w:ascii="Consolas" w:hAnsi="Consolas"/>
+          <w:sz w:val="18"/>
+        </w:rPr>
+        <w:t xml:space="preserve">    OS 2.0 theme + design tokens         :p1a, after p0d, 28d</w:t>
       </w:r>
       <w:r>
         <w:br/>
@@ -6906,7 +6916,16 @@
           </w:tcPr>
           <w:p>
             <w:r>
-              <w:t>UI iteration chosen; API v1 signed off; current-state confirmed.</w:t>
+              <w:t xml:space="preserve">UI iteration chosen; </w:t>
+            </w:r>
+            <w:r>
+              <w:rPr>
+                <w:b/>
+              </w:rPr>
+              <w:t>every design-standard UI has an approved HTML mockup (mockup-first gate, UI Standard §9)</w:t>
+            </w:r>
+            <w:r>
+              <w:t>; API v1 signed off; current-state confirmed.</w:t>
             </w:r>
           </w:p>
         </w:tc>
@@ -7117,10 +7136,34 @@
     <w:p/>
     <w:p>
       <w:pPr>
-        <w:pStyle w:val="Heading3"/>
+        <w:pStyle w:val="IntenseQuote"/>
+        <w:ind w:left="432"/>
       </w:pPr>
       <w:r>
-        <w:t>11.1 Sandbox live testing &amp; demo — the pre-swap gate</w:t>
+        <w:rPr>
+          <w:b/>
+          <w:i/>
+        </w:rPr>
+        <w:t>Mockup-first gate (Phase 0–1):</w:t>
+      </w:r>
+      <w:r>
+        <w:rPr>
+          <w:i/>
+        </w:rPr>
+        <w:t xml:space="preserve"> per the UI Standard §9, </w:t>
+      </w:r>
+      <w:r>
+        <w:rPr>
+          <w:b/>
+          <w:i/>
+        </w:rPr>
+        <w:t>every UI ships an approved HTML mockup before any theme code is written.</w:t>
+      </w:r>
+      <w:r>
+        <w:rPr>
+          <w:i/>
+        </w:rPr>
+        <w:t xml:space="preserve"> No UI is build-ready without an approved mockup; the approved mockups are the reference for the §11.1 sandbox demo.</w:t>
       </w:r>
     </w:p>
     <w:p>

</xml_diff>

<commit_message>
Add customer reviews / UGC across the plan docs
- Master Plan: G7 goal; §6.6 Customer reviews & UGC (verified-buyer, post-fulfillment
  review_request job, family-level aggregation, moderation, AggregateRating/Review SEO,
  reviews-app + CRM-trigger approach); integration-matrix rows; reviews IA routes; NFR
  row; data-model note; roadmap task (P1); KPI; risk R9; decision D13
- Workflows: Workflow I (Customer Reviews post-purchase UGC) with sequence + rules;
  scope now four cross-cutting flows; decision/error/ops-moderation entries
- UI Standard: star rating / review summary+histogram / review card / write-a-review
  components; PDP reviews section + collection star badges; a11y for star widgets;
  register rows (reviews.html, write-review.html)
- Regenerate Word docs

https://claude.ai/code/session_01PjUHwFTYmLhh9nLNKk68Yq
</commit_message>
<xml_diff>
--- a/word/01-Master-Plan.docx
+++ b/word/01-Master-Plan.docx
@@ -699,6 +699,38 @@
       </w:r>
       <w:r>
         <w:t xml:space="preserve"> — Preserve SEO, brand equity, and existing customer accounts during cutover.</w:t>
+      </w:r>
+    </w:p>
+    <w:p>
+      <w:pPr>
+        <w:pStyle w:val="ListBullet"/>
+      </w:pPr>
+      <w:r>
+        <w:rPr>
+          <w:b/>
+        </w:rPr>
+        <w:t>G7</w:t>
+      </w:r>
+      <w:r>
+        <w:t xml:space="preserve"> — Capture and display </w:t>
+      </w:r>
+      <w:r>
+        <w:rPr>
+          <w:b/>
+        </w:rPr>
+        <w:t>customer reviews &amp; photo UGC</w:t>
+      </w:r>
+      <w:r>
+        <w:t xml:space="preserve"> — verified-buyer, invited </w:t>
+      </w:r>
+      <w:r>
+        <w:rPr>
+          <w:b/>
+        </w:rPr>
+        <w:t>after fulfillment</w:t>
+      </w:r>
+      <w:r>
+        <w:t>, aggregated at the product-family level, moderated, with review structured data for SEO. (Reviews are the trust mechanism in place of returns.)</w:t>
       </w:r>
     </w:p>
     <w:p>
@@ -4104,6 +4136,166 @@
           </w:p>
         </w:tc>
       </w:tr>
+      <w:tr>
+        <w:tc>
+          <w:tcPr>
+            <w:tcW w:type="dxa" w:w="2412"/>
+          </w:tcPr>
+          <w:p>
+            <w:r>
+              <w:t>MEJA‑CRM → reviews/email</w:t>
+            </w:r>
+          </w:p>
+        </w:tc>
+        <w:tc>
+          <w:tcPr>
+            <w:tcW w:type="dxa" w:w="2412"/>
+          </w:tcPr>
+          <w:p>
+            <w:r>
+              <w:t>async</w:t>
+            </w:r>
+          </w:p>
+        </w:tc>
+        <w:tc>
+          <w:tcPr>
+            <w:tcW w:type="dxa" w:w="2412"/>
+          </w:tcPr>
+          <w:p>
+            <w:r>
+              <w:rPr>
+                <w:rFonts w:ascii="Consolas" w:hAnsi="Consolas"/>
+                <w:sz w:val="19"/>
+              </w:rPr>
+              <w:t>integration_jobs</w:t>
+            </w:r>
+            <w:r>
+              <w:t xml:space="preserve"> </w:t>
+            </w:r>
+            <w:r>
+              <w:rPr>
+                <w:rFonts w:ascii="Consolas" w:hAnsi="Consolas"/>
+                <w:sz w:val="19"/>
+              </w:rPr>
+              <w:t>review_request</w:t>
+            </w:r>
+          </w:p>
+        </w:tc>
+        <w:tc>
+          <w:tcPr>
+            <w:tcW w:type="dxa" w:w="2412"/>
+          </w:tcPr>
+          <w:p>
+            <w:r>
+              <w:t>post-fulfillment review invite to verified buyers</w:t>
+            </w:r>
+          </w:p>
+        </w:tc>
+      </w:tr>
+      <w:tr>
+        <w:tc>
+          <w:tcPr>
+            <w:tcW w:type="dxa" w:w="2412"/>
+          </w:tcPr>
+          <w:p>
+            <w:r>
+              <w:t>Reviews app ↔ Shopify</w:t>
+            </w:r>
+          </w:p>
+        </w:tc>
+        <w:tc>
+          <w:tcPr>
+            <w:tcW w:type="dxa" w:w="2412"/>
+          </w:tcPr>
+          <w:p>
+            <w:r>
+              <w:t>sync</w:t>
+            </w:r>
+          </w:p>
+        </w:tc>
+        <w:tc>
+          <w:tcPr>
+            <w:tcW w:type="dxa" w:w="2412"/>
+          </w:tcPr>
+          <w:p>
+            <w:r>
+              <w:t>app + theme app-blocks</w:t>
+            </w:r>
+          </w:p>
+        </w:tc>
+        <w:tc>
+          <w:tcPr>
+            <w:tcW w:type="dxa" w:w="2412"/>
+          </w:tcPr>
+          <w:p>
+            <w:r>
+              <w:t xml:space="preserve">capture/display ratings, text, photo UGC; SEO </w:t>
+            </w:r>
+            <w:r>
+              <w:rPr>
+                <w:rFonts w:ascii="Consolas" w:hAnsi="Consolas"/>
+                <w:sz w:val="19"/>
+              </w:rPr>
+              <w:t>AggregateRating</w:t>
+            </w:r>
+            <w:r>
+              <w:t>/</w:t>
+            </w:r>
+            <w:r>
+              <w:rPr>
+                <w:rFonts w:ascii="Consolas" w:hAnsi="Consolas"/>
+                <w:sz w:val="19"/>
+              </w:rPr>
+              <w:t>Review</w:t>
+            </w:r>
+            <w:r>
+              <w:t xml:space="preserve"> schema</w:t>
+            </w:r>
+          </w:p>
+        </w:tc>
+      </w:tr>
+      <w:tr>
+        <w:tc>
+          <w:tcPr>
+            <w:tcW w:type="dxa" w:w="2412"/>
+          </w:tcPr>
+          <w:p>
+            <w:r>
+              <w:t>Reviews → MEJA‑CRM</w:t>
+            </w:r>
+          </w:p>
+        </w:tc>
+        <w:tc>
+          <w:tcPr>
+            <w:tcW w:type="dxa" w:w="2412"/>
+          </w:tcPr>
+          <w:p>
+            <w:r>
+              <w:t>async</w:t>
+            </w:r>
+          </w:p>
+        </w:tc>
+        <w:tc>
+          <w:tcPr>
+            <w:tcW w:type="dxa" w:w="2412"/>
+          </w:tcPr>
+          <w:p>
+            <w:r>
+              <w:t>webhook / sync</w:t>
+            </w:r>
+          </w:p>
+        </w:tc>
+        <w:tc>
+          <w:tcPr>
+            <w:tcW w:type="dxa" w:w="2412"/>
+          </w:tcPr>
+          <w:p>
+            <w:r>
+              <w:t>ingest reviews for marketing (Ad Studio) + customer lead scoring</w:t>
+            </w:r>
+          </w:p>
+        </w:tc>
+      </w:tr>
     </w:tbl>
     <w:p/>
     <w:p>
@@ -4964,6 +5156,234 @@
       </w:r>
       <w:r>
         <w:t xml:space="preserve"> stored in a managed secret store; never in the storefront bundle.</w:t>
+      </w:r>
+    </w:p>
+    <w:p>
+      <w:pPr>
+        <w:pStyle w:val="Heading3"/>
+      </w:pPr>
+      <w:r>
+        <w:t>6.6 Customer reviews &amp; UGC</w:t>
+      </w:r>
+    </w:p>
+    <w:p>
+      <w:r>
+        <w:t xml:space="preserve">The store carries </w:t>
+      </w:r>
+      <w:r>
+        <w:rPr>
+          <w:b/>
+        </w:rPr>
+        <w:t>product reviews</w:t>
+      </w:r>
+      <w:r>
+        <w:t xml:space="preserve"> — rating + text + </w:t>
+      </w:r>
+      <w:r>
+        <w:rPr>
+          <w:b/>
+        </w:rPr>
+        <w:t>customer photos</w:t>
+      </w:r>
+      <w:r>
+        <w:t xml:space="preserve"> — which matter especially for handmade pieces (buyers want to see </w:t>
+      </w:r>
+      <w:r>
+        <w:rPr>
+          <w:i/>
+        </w:rPr>
+        <w:t>real</w:t>
+      </w:r>
+      <w:r>
+        <w:t xml:space="preserve"> made results) and serve as the </w:t>
+      </w:r>
+      <w:r>
+        <w:rPr>
+          <w:b/>
+        </w:rPr>
+        <w:t>trust mechanism in place of returns</w:t>
+      </w:r>
+      <w:r>
+        <w:t>.</w:t>
+      </w:r>
+    </w:p>
+    <w:p>
+      <w:pPr>
+        <w:pStyle w:val="ListBullet"/>
+      </w:pPr>
+      <w:r>
+        <w:rPr>
+          <w:b/>
+        </w:rPr>
+        <w:t>Verified-buyer only:</w:t>
+      </w:r>
+      <w:r>
+        <w:t xml:space="preserve"> reviews are invited </w:t>
+      </w:r>
+      <w:r>
+        <w:rPr>
+          <w:b/>
+        </w:rPr>
+        <w:t>after fulfillment</w:t>
+      </w:r>
+      <w:r>
+        <w:t xml:space="preserve">. The CRM (which owns </w:t>
+      </w:r>
+      <w:r>
+        <w:rPr>
+          <w:rFonts w:ascii="Consolas" w:hAnsi="Consolas"/>
+          <w:sz w:val="19"/>
+        </w:rPr>
+        <w:t>store_orders</w:t>
+      </w:r>
+      <w:r>
+        <w:t xml:space="preserve"> + fulfillment) enqueues a </w:t>
+      </w:r>
+      <w:r>
+        <w:rPr>
+          <w:b/>
+        </w:rPr>
+        <w:t>`review_request`</w:t>
+      </w:r>
+      <w:r>
+        <w:t xml:space="preserve"> job that emails/SMSes the buyer after a delivery window; only fulfilled-order buyers can review.</w:t>
+      </w:r>
+    </w:p>
+    <w:p>
+      <w:pPr>
+        <w:pStyle w:val="ListBullet"/>
+      </w:pPr>
+      <w:r>
+        <w:rPr>
+          <w:b/>
+        </w:rPr>
+        <w:t>Family-level aggregation:</w:t>
+      </w:r>
+      <w:r>
+        <w:t xml:space="preserve"> because configurable and private listings are unique per order, reviews aggregate to the </w:t>
+      </w:r>
+      <w:r>
+        <w:rPr>
+          <w:b/>
+        </w:rPr>
+        <w:t>product family / `product_type`</w:t>
+      </w:r>
+      <w:r>
+        <w:t xml:space="preserve"> (e.g., "Tile Shelf"), not the one-off listing — so a configured or private purchase still contributes its review + photos to the family PDP. One-off </w:t>
+      </w:r>
+      <w:r>
+        <w:rPr>
+          <w:b/>
+        </w:rPr>
+        <w:t>private</w:t>
+      </w:r>
+      <w:r>
+        <w:t xml:space="preserve"> listing pages don't show public reviews.</w:t>
+      </w:r>
+    </w:p>
+    <w:p>
+      <w:pPr>
+        <w:pStyle w:val="ListBullet"/>
+      </w:pPr>
+      <w:r>
+        <w:rPr>
+          <w:b/>
+        </w:rPr>
+        <w:t>Moderation:</w:t>
+      </w:r>
+      <w:r>
+        <w:t xml:space="preserve"> automated spam/profanity + photo screening, then </w:t>
+      </w:r>
+      <w:r>
+        <w:rPr>
+          <w:b/>
+        </w:rPr>
+        <w:t>CS approval</w:t>
+      </w:r>
+      <w:r>
+        <w:t xml:space="preserve"> before publish; the brand can </w:t>
+      </w:r>
+      <w:r>
+        <w:rPr>
+          <w:b/>
+        </w:rPr>
+        <w:t>respond publicly</w:t>
+      </w:r>
+      <w:r>
+        <w:t>.</w:t>
+      </w:r>
+    </w:p>
+    <w:p>
+      <w:pPr>
+        <w:pStyle w:val="ListBullet"/>
+      </w:pPr>
+      <w:r>
+        <w:rPr>
+          <w:b/>
+        </w:rPr>
+        <w:t>Display:</w:t>
+      </w:r>
+      <w:r>
+        <w:t xml:space="preserve"> PDP reviews section (summary, star histogram, photo gallery, sortable/filterable cards), collection-card </w:t>
+      </w:r>
+      <w:r>
+        <w:rPr>
+          <w:b/>
+        </w:rPr>
+        <w:t>star badges</w:t>
+      </w:r>
+      <w:r>
+        <w:t xml:space="preserve">, and home social proof; emit </w:t>
+      </w:r>
+      <w:r>
+        <w:rPr>
+          <w:b/>
+        </w:rPr>
+        <w:t>`AggregateRating`/`Review`</w:t>
+      </w:r>
+      <w:r>
+        <w:t xml:space="preserve"> structured data for SEO.</w:t>
+      </w:r>
+    </w:p>
+    <w:p>
+      <w:pPr>
+        <w:pStyle w:val="ListBullet"/>
+      </w:pPr>
+      <w:r>
+        <w:rPr>
+          <w:b/>
+        </w:rPr>
+        <w:t>Approach (Decision D13):</w:t>
+      </w:r>
+      <w:r>
+        <w:t xml:space="preserve"> a reviews app (e.g., </w:t>
+      </w:r>
+      <w:r>
+        <w:rPr>
+          <w:b/>
+        </w:rPr>
+        <w:t>Judge.me / Loox / Okendo</w:t>
+      </w:r>
+      <w:r>
+        <w:t xml:space="preserve"> — strong photo-UGC, theme app-blocks, schema) for capture/display, with </w:t>
+      </w:r>
+      <w:r>
+        <w:rPr>
+          <w:b/>
+        </w:rPr>
+        <w:t>requests triggered by the CRM</w:t>
+      </w:r>
+      <w:r>
+        <w:t xml:space="preserve"> post-fulfillment; reviews optionally ingested into the CRM for </w:t>
+      </w:r>
+      <w:r>
+        <w:rPr>
+          <w:b/>
+        </w:rPr>
+        <w:t>Ad Studio</w:t>
+      </w:r>
+      <w:r>
+        <w:t xml:space="preserve"> + lead scoring.</w:t>
       </w:r>
     </w:p>
     <w:p>
@@ -5391,6 +5811,39 @@
       </w:r>
       <w:r>
         <w:t xml:space="preserve"> + the config snapshot + 4K URL into Shopify so checkout/back-office see exactly what was bought.</w:t>
+      </w:r>
+    </w:p>
+    <w:p>
+      <w:pPr>
+        <w:pStyle w:val="ListBullet"/>
+      </w:pPr>
+      <w:r>
+        <w:rPr>
+          <w:b/>
+        </w:rPr>
+        <w:t>Reviews</w:t>
+      </w:r>
+      <w:r>
+        <w:t xml:space="preserve"> live in the reviews app (per D13), keyed to the </w:t>
+      </w:r>
+      <w:r>
+        <w:rPr>
+          <w:b/>
+        </w:rPr>
+        <w:t>product family / `product_type`</w:t>
+      </w:r>
+      <w:r>
+        <w:t xml:space="preserve"> (not unique listings), with verified-buyer + moderation state; optionally ingested into a CRM </w:t>
+      </w:r>
+      <w:r>
+        <w:rPr>
+          <w:rFonts w:ascii="Consolas" w:hAnsi="Consolas"/>
+          <w:sz w:val="19"/>
+        </w:rPr>
+        <w:t>reviews</w:t>
+      </w:r>
+      <w:r>
+        <w:t xml:space="preserve"> table for marketing / lead-scoring.</w:t>
       </w:r>
     </w:p>
     <w:p>
@@ -5564,7 +6017,62 @@
           </w:tcPr>
           <w:p>
             <w:r>
-              <w:t>Standard PDP.</w:t>
+              <w:t xml:space="preserve">Standard PDP; </w:t>
+            </w:r>
+            <w:r>
+              <w:rPr>
+                <w:b/>
+              </w:rPr>
+              <w:t>reviews section</w:t>
+            </w:r>
+            <w:r>
+              <w:t xml:space="preserve"> (family-level) + star summary.</w:t>
+            </w:r>
+          </w:p>
+        </w:tc>
+      </w:tr>
+      <w:tr>
+        <w:tc>
+          <w:tcPr>
+            <w:tcW w:type="dxa" w:w="3216"/>
+          </w:tcPr>
+          <w:p>
+            <w:r>
+              <w:rPr>
+                <w:rFonts w:ascii="Consolas" w:hAnsi="Consolas"/>
+                <w:sz w:val="19"/>
+              </w:rPr>
+              <w:t>/products/:handle#reviews</w:t>
+            </w:r>
+            <w:r>
+              <w:t xml:space="preserve"> · </w:t>
+            </w:r>
+            <w:r>
+              <w:rPr>
+                <w:rFonts w:ascii="Consolas" w:hAnsi="Consolas"/>
+                <w:sz w:val="19"/>
+              </w:rPr>
+              <w:t>/account/reviews</w:t>
+            </w:r>
+          </w:p>
+        </w:tc>
+        <w:tc>
+          <w:tcPr>
+            <w:tcW w:type="dxa" w:w="3216"/>
+          </w:tcPr>
+          <w:p>
+            <w:r>
+              <w:t>Reviews</w:t>
+            </w:r>
+          </w:p>
+        </w:tc>
+        <w:tc>
+          <w:tcPr>
+            <w:tcW w:type="dxa" w:w="3216"/>
+          </w:tcPr>
+          <w:p>
+            <w:r>
+              <w:t>PDP reviews block; "write a review" (verified-buyer) from order history; collection cards show star badges.</w:t>
             </w:r>
           </w:p>
         </w:tc>
@@ -6438,7 +6946,52 @@
           </w:tcPr>
           <w:p>
             <w:r>
-              <w:t>SSR for public pages; clean URLs; structured data; private listings excluded from indexing.</w:t>
+              <w:t xml:space="preserve">SSR for public pages; clean URLs; structured data (incl. </w:t>
+            </w:r>
+            <w:r>
+              <w:rPr>
+                <w:rFonts w:ascii="Consolas" w:hAnsi="Consolas"/>
+                <w:sz w:val="19"/>
+              </w:rPr>
+              <w:t>AggregateRating</w:t>
+            </w:r>
+            <w:r>
+              <w:t>/</w:t>
+            </w:r>
+            <w:r>
+              <w:rPr>
+                <w:rFonts w:ascii="Consolas" w:hAnsi="Consolas"/>
+                <w:sz w:val="19"/>
+              </w:rPr>
+              <w:t>Review</w:t>
+            </w:r>
+            <w:r>
+              <w:t>); private listings excluded from indexing.</w:t>
+            </w:r>
+          </w:p>
+        </w:tc>
+      </w:tr>
+      <w:tr>
+        <w:tc>
+          <w:tcPr>
+            <w:tcW w:type="dxa" w:w="4824"/>
+          </w:tcPr>
+          <w:p>
+            <w:r>
+              <w:rPr>
+                <w:b/>
+              </w:rPr>
+              <w:t>Reviews/UGC</w:t>
+            </w:r>
+          </w:p>
+        </w:tc>
+        <w:tc>
+          <w:tcPr>
+            <w:tcW w:type="dxa" w:w="4824"/>
+          </w:tcPr>
+          <w:p>
+            <w:r>
+              <w:t>Verified-buyer gating; spam/profanity + photo moderation before publish; accessible star widgets (keyboard + AT); no PII in published photos.</w:t>
             </w:r>
           </w:p>
         </w:tc>
@@ -6701,6 +7254,16 @@
           <w:sz w:val="18"/>
         </w:rPr>
         <w:t xml:space="preserve">    Private/hybrid listing push          :p1c, after p1b, 21d</w:t>
+      </w:r>
+      <w:r>
+        <w:br/>
+      </w:r>
+      <w:r>
+        <w:rPr>
+          <w:rFonts w:ascii="Consolas" w:hAnsi="Consolas"/>
+          <w:sz w:val="18"/>
+        </w:rPr>
+        <w:t xml:space="preserve">    Reviews &amp; UGC (verified-buyer)        :p1d, after p1c, 14d</w:t>
       </w:r>
       <w:r>
         <w:br/>
@@ -8476,6 +9039,58 @@
           </w:p>
         </w:tc>
       </w:tr>
+      <w:tr>
+        <w:tc>
+          <w:tcPr>
+            <w:tcW w:type="dxa" w:w="1930"/>
+          </w:tcPr>
+          <w:p>
+            <w:r>
+              <w:t>R9</w:t>
+            </w:r>
+          </w:p>
+        </w:tc>
+        <w:tc>
+          <w:tcPr>
+            <w:tcW w:type="dxa" w:w="1930"/>
+          </w:tcPr>
+          <w:p>
+            <w:r>
+              <w:t>Fake/abusive reviews or photo misuse</w:t>
+            </w:r>
+          </w:p>
+        </w:tc>
+        <w:tc>
+          <w:tcPr>
+            <w:tcW w:type="dxa" w:w="1930"/>
+          </w:tcPr>
+          <w:p>
+            <w:r>
+              <w:t>Med</w:t>
+            </w:r>
+          </w:p>
+        </w:tc>
+        <w:tc>
+          <w:tcPr>
+            <w:tcW w:type="dxa" w:w="1930"/>
+          </w:tcPr>
+          <w:p>
+            <w:r>
+              <w:t>Med</w:t>
+            </w:r>
+          </w:p>
+        </w:tc>
+        <w:tc>
+          <w:tcPr>
+            <w:tcW w:type="dxa" w:w="1930"/>
+          </w:tcPr>
+          <w:p>
+            <w:r>
+              <w:t>Verified-buyer only (post-fulfillment); auto spam/profanity + photo screening; CS approval before publish; takedown + response path.</w:t>
+            </w:r>
+          </w:p>
+        </w:tc>
+      </w:tr>
     </w:tbl>
     <w:p/>
     <w:p>
@@ -8584,6 +9199,29 @@
       </w:r>
       <w:r>
         <w:t xml:space="preserve"> across the four product modes.</w:t>
+      </w:r>
+    </w:p>
+    <w:p>
+      <w:pPr>
+        <w:pStyle w:val="ListBullet"/>
+      </w:pPr>
+      <w:r>
+        <w:rPr>
+          <w:b/>
+        </w:rPr>
+        <w:t>Review coverage &amp; rating:</w:t>
+      </w:r>
+      <w:r>
+        <w:t xml:space="preserve"> request→submit rate, average star rating, and </w:t>
+      </w:r>
+      <w:r>
+        <w:rPr>
+          <w:b/>
+        </w:rPr>
+        <w:t>photo-review %</w:t>
+      </w:r>
+      <w:r>
+        <w:t>.</w:t>
       </w:r>
     </w:p>
     <w:p>
@@ -9524,6 +10162,63 @@
             </w:r>
             <w:r>
               <w:t xml:space="preserve"> for one-brand consistency across CRM, Atelier3D, and store. </w:t>
+            </w:r>
+            <w:r>
+              <w:rPr>
+                <w:i/>
+              </w:rPr>
+              <w:t>(New.)</w:t>
+            </w:r>
+          </w:p>
+        </w:tc>
+      </w:tr>
+      <w:tr>
+        <w:tc>
+          <w:tcPr>
+            <w:tcW w:type="dxa" w:w="2412"/>
+          </w:tcPr>
+          <w:p>
+            <w:r>
+              <w:rPr>
+                <w:b/>
+              </w:rPr>
+              <w:t>D13</w:t>
+            </w:r>
+          </w:p>
+        </w:tc>
+        <w:tc>
+          <w:tcPr>
+            <w:tcW w:type="dxa" w:w="2412"/>
+          </w:tcPr>
+          <w:p>
+            <w:r>
+              <w:t>Reviews approach + request trigger (§6.6)</w:t>
+            </w:r>
+          </w:p>
+        </w:tc>
+        <w:tc>
+          <w:tcPr>
+            <w:tcW w:type="dxa" w:w="2412"/>
+          </w:tcPr>
+          <w:p>
+            <w:r>
+              <w:t>Reviews app (Judge.me / Loox / Okendo) / native metaobjects · request via CRM vs app</w:t>
+            </w:r>
+          </w:p>
+        </w:tc>
+        <w:tc>
+          <w:tcPr>
+            <w:tcW w:type="dxa" w:w="2412"/>
+          </w:tcPr>
+          <w:p>
+            <w:r>
+              <w:rPr>
+                <w:b/>
+              </w:rPr>
+              <w:t>Reviews app + CRM-triggered requests</w:t>
+            </w:r>
+            <w:r>
+              <w:t xml:space="preserve"> (verified-buyer, post-fulfillment, photo UGC); ingest reviews into CRM for marketing. </w:t>
             </w:r>
             <w:r>
               <w:rPr>

</xml_diff>

<commit_message>
D2 chosen: Scandi Light. Build full Home + Configurator pages in that direction
- Decision D2 = Variant 5 Scandi Light (Master Plan + UI Standard status updated).
- mockups/home.html: full Scandi Light home — hero (real photo), trust strip, 4 product
  categories (Drawer Boxes/Units/Cabinet Doors/Shelves), how-it-works, 'measure once' band,
  customer reviews (no histogram), made-to-order note, newsletter, footer, mobile preview.
- mockups/configurator.html: full interactive configurator with product-type tabs
  (Drawer Box / Drawer Unit / Cabinet Door / Shelf), real per-product options (joinery,
  width, bottom, undermount; drawers/front/slides; door style/edge/hinge; shelf style/art/
  hooks), shared wood+finish, live price, 4K viewer states, reviews link, made-to-order.
- tools/render_pages.mjs: full-page (uncut) PDF renders. Regenerate docx.

https://claude.ai/code/session_01PjUHwFTYmLhh9nLNKk68Yq
</commit_message>
<xml_diff>
--- a/word/01-Master-Plan.docx
+++ b/word/01-Master-Plan.docx
@@ -9536,14 +9536,17 @@
           </w:tcPr>
           <w:p>
             <w:r>
-              <w:t xml:space="preserve">One of the 10 in </w:t>
+              <w:t>One of the 10 variants (</w:t>
             </w:r>
             <w:r>
               <w:rPr>
-                <w:color w:val="1A4F8A"/>
-                <w:u w:val="single"/>
+                <w:rFonts w:ascii="Consolas" w:hAnsi="Consolas"/>
+                <w:sz w:val="19"/>
               </w:rPr>
-              <w:t>`02-UI-Design-Standard.md`</w:t>
+              <w:t>../mockups/index.html</w:t>
+            </w:r>
+            <w:r>
+              <w:t>)</w:t>
             </w:r>
           </w:p>
         </w:tc>
@@ -9553,34 +9556,16 @@
           </w:tcPr>
           <w:p>
             <w:r>
-              <w:t xml:space="preserve">Shortlist </w:t>
+              <w:t xml:space="preserve">✅ </w:t>
             </w:r>
             <w:r>
               <w:rPr>
                 <w:b/>
               </w:rPr>
-              <w:t>#1 Atelier Gallery</w:t>
-            </w:r>
-            <w:r>
-              <w:t xml:space="preserve">, </w:t>
-            </w:r>
-            <w:r>
-              <w:rPr>
-                <w:b/>
-              </w:rPr>
-              <w:t>#3 Modern Luxe</w:t>
-            </w:r>
-            <w:r>
-              <w:t xml:space="preserve">, </w:t>
-            </w:r>
-            <w:r>
-              <w:rPr>
-                <w:b/>
-              </w:rPr>
-              <w:t>#10 Showroom 3D Immersive</w:t>
-            </w:r>
-            <w:r>
-              <w:t>; pick one + accents.</w:t>
+              <w:t>CHOSEN: Variant 5 — Scandi Light</w:t>
+            </w:r>
+            <w:r>
+              <w:t xml:space="preserve"> (light, sage/slate accent, geometric sans, rounded). Note: this differs from the CRM's indigo "Indigo Atelier" (D12) — confirm whether to keep Scandi's accent or adopt the indigo for suite consistency.</w:t>
             </w:r>
           </w:p>
         </w:tc>

</xml_diff>

<commit_message>
Decision: keep Scandi sage/slate accent (D2/D12); store accent distinct from CRM indigo
Record the accent decision in Master Plan (D2, D12) and UI Standard: store keeps the
--mj-* token structure + neutrals but uses its own sage/slate brand accent (#5b6b73),
not the CRM indigo. Mockups unchanged (already sage/slate). Regenerate docx.

https://claude.ai/code/session_01PjUHwFTYmLhh9nLNKk68Yq
</commit_message>
<xml_diff>
--- a/word/01-Master-Plan.docx
+++ b/word/01-Master-Plan.docx
@@ -9565,7 +9565,7 @@
               <w:t>CHOSEN: Variant 5 — Scandi Light</w:t>
             </w:r>
             <w:r>
-              <w:t xml:space="preserve"> (light, sage/slate accent, geometric sans, rounded). Note: this differs from the CRM's indigo "Indigo Atelier" (D12) — confirm whether to keep Scandi's accent or adopt the indigo for suite consistency.</w:t>
+              <w:t xml:space="preserve"> (light, sage/slate accent, geometric sans, rounded). Accent confirmed — see D12.</w:t>
             </w:r>
           </w:p>
         </w:tc>
@@ -10111,7 +10111,7 @@
           </w:tcPr>
           <w:p>
             <w:r>
-              <w:t>Store design tokens</w:t>
+              <w:t>Store design tokens / accent</w:t>
             </w:r>
           </w:p>
         </w:tc>
@@ -10127,10 +10127,10 @@
               <w:rPr>
                 <w:b/>
               </w:rPr>
-              <w:t>Indigo Atelier `--mj-*`</w:t>
-            </w:r>
-            <w:r>
-              <w:t xml:space="preserve"> / bespoke</w:t>
+              <w:t>Indigo Atelier</w:t>
+            </w:r>
+            <w:r>
+              <w:t xml:space="preserve"> accent / keep Scandi</w:t>
             </w:r>
           </w:p>
         </w:tc>
@@ -10139,20 +10139,23 @@
             <w:tcW w:type="dxa" w:w="2412"/>
           </w:tcPr>
           <w:p>
+            <w:r>
+              <w:t xml:space="preserve">✅ </w:t>
+            </w:r>
             <w:r>
               <w:rPr>
                 <w:b/>
               </w:rPr>
-              <w:t>Adopt Indigo Atelier tokens</w:t>
-            </w:r>
-            <w:r>
-              <w:t xml:space="preserve"> for one-brand consistency across CRM, Atelier3D, and store. </w:t>
+              <w:t>DECIDED: keep the `--mj-*` token *structure* + neutrals, but the store's brand accent is Scandi sage/slate `#5b6b73`</w:t>
+            </w:r>
+            <w:r>
+              <w:t xml:space="preserve"> — intentionally distinct from the CRM's indigo. </w:t>
             </w:r>
             <w:r>
               <w:rPr>
                 <w:i/>
               </w:rPr>
-              <w:t>(New.)</w:t>
+              <w:t>(Compared side-by-side; `assets/MEJA-accent-comparison.pdf`.)</w:t>
             </w:r>
           </w:p>
         </w:tc>

</xml_diff>